<commit_message>
Strengthen automotive chapter 1 theory, literature comparison and source attribution
</commit_message>
<xml_diff>
--- a/research/04_auto_trade/documents/chapter1_auto_trade.docx
+++ b/research/04_auto_trade/documents/chapter1_auto_trade.docx
@@ -26,7 +26,7 @@
     </w:p>
     <w:p>
       <w:r>
-        <w:t>Теоретическое объяснение такого устройства отрасли предложено в исследовании К. Хэда и Т. Майера о размещении многонационального автомобильного производства. Авторы рассматривают выбор страны сборки и рынков сбыта с учётом торговых издержек и связей между штаб-квартирой, производственными подразделениями и покупателями. В этой постановке фирма выбирает, какие модели предлагать на конкретном рынке и из какой части производственной сети их поставлять. Изменение условий торговли может затронуть каждое из этих решений, поэтому реакция производителя не сводится к изменению числа автомобилей, отправленных с одного завода.</w:t>
+        <w:t>Объяснение международной торговли на уровне отраслевых преимуществ дополняется анализом различий между фирмами. В модели М. Мелица производители одной отрасли имеют неодинаковую производительность, а выход на зарубежный рынок требует затрат, которые не зависят от объёма отдельной поставки. Поэтому наличие спроса за рубежом ещё не делает экспорт выгодным для каждого предприятия: ожидаемая прибыль должна покрывать затраты участия. Изменение условий торговли одновременно затрагивает объёмы действующих экспортёров и состав фирм, способных обслуживать внешний рынок. Эта логика связывает расширение торговли с перераспределением долей внутри отрасли.</w:t>
       </w:r>
       <w:r>
         <w:rPr>
@@ -38,7 +38,12 @@
     </w:p>
     <w:p>
       <w:r>
-        <w:t>Для настоящего исследования из данного подхода следует необходимость разграничить конкурентные позиции фирмы и потоки товаров определённого происхождения. Рост импорта автомобилей, произведённых в Китае, может включать продукцию как китайских, так и иностранных производителей. В то же время расширение продаж марки, принадлежащей китайской компании, может обеспечиваться производством за пределами Китая. При анализе первого процесса объектом становится география производственного происхождения, второго — деятельность фирм и брендов. Эти процессы связаны, но требуют разных данных. Отчёты Международного энергетического агентства также разделяют расположение автомобильного производства и местонахождение штаб-квартир производителей, что позволяет сопоставлять международные потоки без отождествления страны сборки с национальностью компании.</w:t>
+        <w:t>Для автомобильного производства данное различие особенно существенно при обсуждении ассортимента и географии сбыта. Поставщик с уже организованным обслуживанием покупателей может наращивать продажи в существующем направлении, тогда как освоение нового требует дополнительных организационных решений. Это позволяет ожидать неодинаковой реакции продолжающих и новых направлений. Однако производительность отдельных фирм и наличие потока по стране относятся к разным уровням наблюдения; фирменная теория здесь объясняет возможный механизм, а страна выступает единицей последующего измерения.</w:t>
+      </w:r>
+    </w:p>
+    <w:p>
+      <w:r>
+        <w:t>Более подробное объяснение организации именно автомобильной отрасли предложено в исследовании К. Хэда и Т. Майера о размещении многонационального автомобильного производства. Авторы выделяют издержки перевозки готового автомобиля, передачи ресурсов от штаб-квартиры к месту сборки и обслуживания зарубежного рынка. Последние включают как переменные затраты, так и фиксированные затраты предложения дополнительной модели. Фирма решает, выводить ли модель на рынок, с какой из имеющихся сборочных площадок её поставлять и какой объём продавать. Близость к покупателю снижает часть торговых затрат, но может сочетаться с более высокой стоимостью сборки или управления зарубежным производством.</w:t>
       </w:r>
       <w:r>
         <w:rPr>
@@ -50,7 +55,24 @@
     </w:p>
     <w:p>
       <w:r>
-        <w:t>Разграничение происхождения и собственности влияет на трактовку конкурентоспособности. Увеличение стоимости ввезённых автомобилей показывает расширение определённого пограничного потока, однако само по себе не определяет, каким компаниям достались доходы и где была создана вся добавленная стоимость. Для таких выводов потребовались бы сведения о владельцах производителей, составе комплектующих и распределении операций между странами. В данной работе происхождение используется как характеристика ввезённого товара. Следовательно, выражение «китайские поставки» означает поставки автомобилей китайского происхождения, а не совокупные продажи всех китайских марок в мире.</w:t>
+        <w:t>Из этой постановки следует, что повышение барьера на готовый автомобиль способно изменить и объём поставок из прежнего источника, и выбор источника для сохранённой модели. У производителя с несколькими сборочными площадками существуют возможности, которых нет у экспортёра с единственным местом выпуска. При этом изменение источника в пределах действующей сети и строительство нового завода различаются по необходимому капиталу и срокам. В модели Хэда и Майера выбор источника осуществляется среди заданных площадок; создание новых мощностей требует отдельного инвестиционного анализа. Для исследования торговли это означает, что один и тот же бренд может сохранить продажи, одновременно сократив ввоз из определённой страны.</w:t>
+      </w:r>
+    </w:p>
+    <w:p>
+      <w:r>
+        <w:t>Для настоящего исследования из данного подхода следует необходимость разграничить конкурентные позиции фирмы и потоки товаров определённого происхождения. Рост импорта автомобилей, произведённых в Китае, может включать продукцию как китайских, так и иностранных производителей. В то же время расширение продаж марки, принадлежащей китайской компании, может обеспечиваться производством за пределами Китая. При анализе первого процесса объектом становится география производственного происхождения, второго — деятельность фирм и брендов. Эти процессы связаны, но требуют разных данных. Отчёты Международного энергетического агентства также разделяют расположение автомобильного производства и местонахождение штаб-квартир производителей, что позволяет сопоставлять международные потоки без отождествления страны сборки с национальностью компании.</w:t>
+      </w:r>
+      <w:r>
+        <w:rPr>
+          <w:rStyle w:val="FootnoteReference"/>
+        </w:rPr>
+        <w:footnoteReference w:id="3"/>
+      </w:r>
+      <w:r/>
+    </w:p>
+    <w:p>
+      <w:r>
+        <w:t>В данной работе выражение «китайские поставки» обозначает автомобили китайского происхождения независимо от национальности владельца марки. Такое определение соответствует объекту таможенного наблюдения. Распределение доходов между компаниями и созданной стоимости между странами относится к другому вопросу, для которого понадобились бы сведения о производственной цепочке.</w:t>
       </w:r>
     </w:p>
     <w:p>
@@ -66,7 +88,7 @@
         <w:rPr>
           <w:rStyle w:val="FootnoteReference"/>
         </w:rPr>
-        <w:footnoteReference w:id="3"/>
+        <w:footnoteReference w:id="4"/>
       </w:r>
       <w:r/>
     </w:p>
@@ -78,7 +100,7 @@
         <w:rPr>
           <w:rStyle w:val="FootnoteReference"/>
         </w:rPr>
-        <w:footnoteReference w:id="4"/>
+        <w:footnoteReference w:id="5"/>
       </w:r>
       <w:r/>
     </w:p>
@@ -90,7 +112,7 @@
         <w:rPr>
           <w:rStyle w:val="FootnoteReference"/>
         </w:rPr>
-        <w:footnoteReference w:id="5"/>
+        <w:footnoteReference w:id="6"/>
       </w:r>
       <w:r/>
     </w:p>
@@ -107,7 +129,7 @@
         <w:rPr>
           <w:rStyle w:val="FootnoteReference"/>
         </w:rPr>
-        <w:footnoteReference w:id="6"/>
+        <w:footnoteReference w:id="7"/>
       </w:r>
       <w:r/>
     </w:p>
@@ -124,7 +146,7 @@
         <w:rPr>
           <w:rStyle w:val="FootnoteReference"/>
         </w:rPr>
-        <w:footnoteReference w:id="7"/>
+        <w:footnoteReference w:id="8"/>
       </w:r>
       <w:r/>
     </w:p>
@@ -136,7 +158,7 @@
         <w:rPr>
           <w:rStyle w:val="FootnoteReference"/>
         </w:rPr>
-        <w:footnoteReference w:id="8"/>
+        <w:footnoteReference w:id="9"/>
       </w:r>
       <w:r/>
     </w:p>
@@ -148,7 +170,7 @@
         <w:rPr>
           <w:rStyle w:val="FootnoteReference"/>
         </w:rPr>
-        <w:footnoteReference w:id="9"/>
+        <w:footnoteReference w:id="10"/>
       </w:r>
       <w:r/>
     </w:p>
@@ -167,34 +189,17 @@
     </w:p>
     <w:p>
       <w:r>
-        <w:t>Торговый барьер изменяет условия доступа иностранного товара на внутренний рынок и тем самым влияет на решения покупателей, импортёров и производителей. Для автомобильной торговли наиболее прямым каналом выступает увеличение издержек ввоза. Однако размер установленной пошлины и изменение конечной цены не являются одной и той же величиной. Между ними находятся решения экспортёра о цене поставки, поведение посредников, изменения ассортимента и реакция конкурентов. Поэтому теоретический анализ должен начинаться с распределения дополнительной нагрузки между участниками рынка.</w:t>
+        <w:t>Торговый барьер меняет соотношение затрат и доходов при обслуживании зарубежного рынка. Адвалорная пошлина начисляется в процентах к таможенной стоимости и увеличивает расходы импортёра, однако её ставка не определяет автоматически рост конечной цены. Экспортёр может изменить цену поставки, импортёр и дилер — наценку, покупатель — выбранную модель. Поэтому экономический результат зависит от распределения нагрузки между участниками и от того, какие альтернативы им доступны.</w:t>
       </w:r>
     </w:p>
     <w:p>
       <w:r>
-        <w:t>В простейшем случае адвалорная пошлина увеличивает расходы импортёра пропорционально стоимости товара, принимаемой для её начисления. Если экспортёр сохраняет прежнюю цену, а посредники не меняют наценку, затраты на приобретение импортного автомобиля возрастают. Покупатель может отказаться от покупки, выбрать другую модель или изменить тип силовой установки. При этом результат зависит от наличия доступных заменителей. Когда переход к альтернативе относительно прост, у поставщика меньше возможностей переложить всю дополнительную нагрузку на покупателя. При ограниченном выборе повышение цены может сопровождаться менее выраженным сокращением спроса.</w:t>
+        <w:t>В конкурентном частичном равновесии распределение нагрузки связывается с относительной чувствительностью спроса и предложения к цене. Сторона, которой сложнее изменить объём сделки, обычно принимает большую часть дополнительной нагрузки. Если у покупателя много близких заменителей, повышение цены сильнее сокращает спрос и ограничивает возможности поставщика переложить на него пошлину. При ограниченном выборе объём может реагировать слабее. Такой подход объясняет, почему одинаковый тариф способен сопровождаться разными изменениями количества и цены в различных товарных сегментах.</w:t>
       </w:r>
     </w:p>
     <w:p>
       <w:r>
-        <w:t>Экспортёр, стремящийся сохранить присутствие на рынке, может принять на себя часть нагрузки через снижение цены поставки или маржи. Такая реакция имеет ограничения: она зависит от исходной прибыльности, структуры затрат и стратегической значимости рынка. Для производителя с широкой международной сетью сохранение текущих продаж может быть связано с более длительными задачами развития дилерской сети и узнаваемости марки. Поэтому одинаковая ставка барьера не предполагает одинакового изменения цены у всех поставщиков. Различия между фирмами необходимо учитывать и при переходе от анализа отдельного автомобиля к агрегированному потоку.</w:t>
-      </w:r>
-    </w:p>
-    <w:p>
-      <w:r>
-        <w:t>Эмпирическая литература подтверждает важность разграничения разных уровней цен. М. Амити, С. Реддинг и Д. Вайнштейн исследуют тарифный эпизод 2018 года в США и показывают, как распределение нагрузки связано с изменением импортных цен, количества и доступных разновидностей товаров. А. Кавалло с соавторами отдельно сопоставляют пограничные и розничные цены и выявляют различия их реакции. Для автомобильного исследования важен сам вывод о необходимости наблюдать цепочку передачи издержек. Конкретные оценки американского эпизода не задают готового параметра для китайских автомобилей в ЕС: различаются товары, рыночная структура и условия регулирования.</w:t>
-      </w:r>
-      <w:r>
-        <w:rPr>
-          <w:rStyle w:val="FootnoteReference"/>
-        </w:rPr>
-        <w:footnoteReference w:id="10"/>
-      </w:r>
-      <w:r/>
-    </w:p>
-    <w:p>
-      <w:r>
-        <w:t>При анализе европейских мер необходимо различать общий импортный тариф и компенсационную меру. Компенсационные меры связаны с расследованием субсидируемого импорта и его воздействия на промышленность импортирующей стороны. Европейская комиссия указывает, что при таком расследовании рассматриваются наличие субсидирования, ущерб отрасли, связь между ними и интересы ЕС. Следовательно, данный инструмент имеет определённое правовое основание и не тождественен любой политике ограничения импорта. В то же время юридическое обоснование введения меры и экономическая оценка всех её последствий отвечают на разные вопросы.</w:t>
+        <w:t>В автомобильной отрасли модели дифференцированы, а производители управляют ассортиментом. Поэтому имеет значение не только чувствительность спроса на отдельную машину, но и то, куда переходит покупатель: к другой модели того же производителя, к конкуренту или за пределы рынка новых автомобилей. В модели П. Барвик с соавторами фирма учитывает взаимное влияние продаж собственных моделей при установлении цен. Нагрузка на один товар тем самым способна изменить ценовые решения и по другим товарам её ассортимента.</w:t>
       </w:r>
       <w:r>
         <w:rPr>
@@ -206,12 +211,12 @@
     </w:p>
     <w:p>
       <w:r>
-        <w:t>Субсидия способна воздействовать на предложение несколькими путями. Поддержка капитальных вложений облегчает создание производственных мощностей, финансирование исследований влияет на разработку технологий, а льготные условия привлечения ресурсов могут снижать текущие издержки. Поддержка покупателя, напротив, действует прежде всего через условия приобретения автомобиля и спрос. Объединение этих инструментов в одну сумму затрудняет объяснение реакции рынка. Даже при одинаковом размере государственных расходов они могут по-разному влиять на выпуск, структуру моделей и направление международных поставок.</w:t>
+        <w:t>Это различие важно для интерпретации возможного роста гибридных поставок. Часть покупателей может перейти к PHEV после относительного удорожания BEV, но расширение предложения гибридов также способно быть самостоятельной стратегией производителя. Наличие нескольких силовых установок в модельном ряду облегчает перераспределение продаж, тогда как специализация только на BEV сужает выбор. Следовательно, реакция определяется пересечением потребительского замещения и возможностей предложения, а не только формальным различием ставок.</w:t>
       </w:r>
     </w:p>
     <w:p>
       <w:r>
-        <w:t>Ф. Биккенбах с соавторами рассматривают китайскую промышленную поддержку как сочетание прямых и косвенных инструментов. Их исследование показывает необходимость различать поддержку производителя, меры стимулирования покупки и условия предоставления ресурсов. Вместе с тем авторы обращают внимание на сложности измерения и сопоставления государственной помощи. Поэтому сам факт существования поддержки ещё не позволяет количественно установить её вклад в конкурентоспособность конкретного автомобиля. Для этого нужно определить условия получения средств, круг получателей и то, как помощь меняет решения фирм. В рамках торгового анализа сведения о субсидиях прежде всего объясняют институциональный контекст конкуренции.</w:t>
+        <w:t>Исследования тарифного эпизода 2018 года в США показывают, зачем разделять цены на разных этапах движения товара. М. Амити, С. Реддинг и Д. Вайнштейн анализируют импортные цены, объёмы и доступные разновидности, а А. Кавалло с соавторами сопоставляют пограничные и розничные цены. Их работы объясняют, почему сохранение цены экспортёра ещё не означает сохранения затрат покупателя, а изменения в рознице могут отличаться от изменений на границе. Для европейской автомобильной торговли это прежде всего требование к выбору показателя: средняя таможенная стоимость и розничная цена отражают разные звенья передачи издержек.</w:t>
       </w:r>
       <w:r>
         <w:rPr>
@@ -223,12 +228,7 @@
     </w:p>
     <w:p>
       <w:r>
-        <w:t>Технологический переход добавляет к обычной задаче защиты производства ещё одну цель — изменение структуры используемого транспорта. Удорожание ввозимых электромобилей может создавать более благоприятные условия для конкурирующих местных производителей, но одновременно менять доступность электрической технологии для покупателя. При этом эффект зависит от того, какие модели предоставляют ближайшую альтернативу: другие электромобили, подключаемые гибриды или автомобили с обычным двигателем внутреннего сгорания. Следовательно, оценка только защищаемого сегмента может не учитывать изменения в связанных частях автомобильного рынка.</w:t>
-      </w:r>
-    </w:p>
-    <w:p>
-      <w:r>
-        <w:t>Х. Доу с соавторами исследуют это противоречие через совокупную стоимость владения и сценарии распространения электромобилей. В их постановке последствия торгового ограничения зависят от ответных стратегий производителей и различаются между странами и автомобильными классами. Такая неоднородность имеет экономическое объяснение: исходная доступность моделей и чувствительность покупателей к затратам неодинаковы. Однако сценарий принятия технологии не равен наблюдаемому изменению таможенных поставок. Он описывает результат при заданных предпосылках о поведении и развитии рынка, которые необходимо учитывать при сопоставлении с фактической статистикой.</w:t>
+        <w:t>Общий импортный тариф необходимо отличать от компенсационной меры против субсидируемого импорта. В европейской процедуре рассматриваются субсидирование, ущерб отрасли, причинная связь между ними и интересы ЕС. Поэтому компенсационная мера имеет специальное правовое основание. Вместе с тем наличие такого основания не отвечает на все экономические вопросы о последствиях для покупателей, производителей и бюджета. Правовая проверка субсидирования и оценка общественного результата политики выполняют разные задачи.</w:t>
       </w:r>
       <w:r>
         <w:rPr>
@@ -240,7 +240,12 @@
     </w:p>
     <w:p>
       <w:r>
-        <w:t>Влияние барьера также может распространяться по производственной цепочке. Ограничение ввоза готового автомобиля и ограничение ввоза его компонентов создают разные стимулы. В первом случае может измениться конкурентное положение сборочных предприятий, во втором — стоимость используемых ими ресурсов. Рабочая статья Д. Коффина с соавторами для USITC рассматривает такие связи в модели общего равновесия, разделяющей готовые электромобили, гибриды и комплектующие. Полученные сценарии показывают, почему итоговые изменения выпуска и торговли зависят от уровня цепочки, к которому применяется мера. Они не позволяют заменить наблюдение отдельных рынков одной универсальной оценкой.</w:t>
+        <w:t>Промышленная поддержка влияет на международную конкуренцию через несколько решений фирмы. Субсидирование капитальных вложений облегчает создание мощностей; финансирование исследований — разработку новой технологии; льготное кредитование — привлечение ресурсов. Поддержка покупателя действует прежде всего через спрос. Даже одинаковые государственные расходы могут давать разный результат в зависимости от того, снижаются ли текущие затраты выпуска, расходы на разработку или цена приобретения автомобиля.</w:t>
+      </w:r>
+    </w:p>
+    <w:p>
+      <w:r>
+        <w:t>Ф. Биккенбах с соавторами рассматривают китайские субсидии как сочетание прямых и косвенных инструментов и показывают сложность их измерения. Для анализа конкурентоспособности существенно, кто получает поддержку и как она влияет на производственные решения. Сумма помощи сама по себе не характеризует величину преимущества конкретной модели. В настоящем исследовании сведения о поддержке задают институциональный контекст, тогда как перестройка поставок измеряется по внешнеторговым данным.</w:t>
       </w:r>
       <w:r>
         <w:rPr>
@@ -252,7 +257,12 @@
     </w:p>
     <w:p>
       <w:r>
-        <w:t>Сходное значение имеет включённость национальных экономик в международное производство. В работе Ф. Вингендера с соавторами для МВФ европейский переход к электромобилям рассматривается совместно с конкуренцией со стороны Китая и связями автомобильного сектора с другими отраслями. В используемых сценариях значение имеют не только импорт готовых машин, но и размещение производства и прямые инвестиции. Поэтому одинаковое изменение конкуренции может по-разному затрагивать страны с различной производственной специализацией. Для торгового исследования это означает, что распределение ввоза между государствами ЕС нельзя автоматически считать распределением итогового макроэкономического эффекта.</w:t>
+        <w:t>Технологический переход усложняет выбор политики, поскольку интересы защищаемой промышленности и доступность электрического транспорта могут изменяться в разных направлениях. Удорожание импортного BEV улучшает относительные условия для одних конкурентов, но результат для электрификации зависит от выбранной покупателем альтернативы. Переход к другому BEV, подключаемому гибриду и автомобилю с обычным двигателем внутреннего сгорания означает разные изменения использования технологии. Следовательно, рост продаж местного производителя и увеличение доли электромобилей не являются одним и тем же результатом.</w:t>
+      </w:r>
+    </w:p>
+    <w:p>
+      <w:r>
+        <w:t>Х. Доу с соавторами связывают этот вопрос с совокупной стоимостью владения, включающей затраты приобретения и эксплуатации. Авторы сопоставляют сценарии ценового приспособления, переноса производства в ЕС и сокращения доступности китайских BEV. Последствия различаются по странам и автомобильным классам. Важно, что эти стратегии заданы как альтернативные сценарии: работа показывает, как меняется технологический переход при разных ответах производителей, а не устанавливает единственный фактически реализованный ответ.</w:t>
       </w:r>
       <w:r>
         <w:rPr>
@@ -264,12 +274,12 @@
     </w:p>
     <w:p>
       <w:r>
-        <w:t>Необходимо учитывать и временной горизонт. В течение короткого периода фирма приспосабливает цены, запасы и состав отгружаемых моделей при уже имеющихся мощностях. Изменение размещения производства требует иных решений и может происходить позднее. Поэтому первоначальная реакция поставок не обязана совпадать с долгосрочным изменением производственной сети. Анализ короткого периода после введения меры характеризует только наблюдаемый этап адаптации. Из него нельзя без дополнительных предпосылок вывести устойчивое изменение структуры мировой автомобильной промышленности.</w:t>
+        <w:t>Экономический смысл локализации состоит в обмене одних затрат на другие. Производство ближе к покупателю позволяет сократить часть расходов международной поставки, но требует капитала, организации снабжения и взаимодействия с местной производственной средой. Выигрыш зависит от ожидаемого объёма сбыта и горизонта эксплуатации мощностей. Поэтому кратковременный спад импорта и устойчивый перенос производства могут совпасть по направлению изменения торговли, оставаясь разными хозяйственными процессами.</w:t>
       </w:r>
     </w:p>
     <w:p>
       <w:r>
-        <w:t>Выбор инструмента политики зависит от того, какие цели и ограничения включены в оценку. П. Барвик с соавторами рассматривают совместное применение тарифа и поддержки внутреннего производства в структурной модели автомобильного рынка. В их подходе благосостояние включает интересы потребителей и производителей, государственные доходы и экологический результат. Значение этой работы для теоретической постановки состоит в том, что один инструмент оценивается вместе с использованием его доходов и устройством конкуренции. Получаемые оптимальные сочетания являются результатом конкретной модели, а не общим предписанием для любой страны и любого периода.</w:t>
+        <w:t>Различаются также ограничения на готовый автомобиль и на его компоненты. Защита сборочного сегмента может облегчать конкуренцию для местного производителя, тогда как удорожание ввозимых деталей повышает его собственные затраты. Д. Коффин с соавторами для USITC разделяют в модели готовые автомобили и комплектующие и прослеживают межотраслевые связи. Такой подход показывает, почему оценка меры зависит от её положения в цепочке: одинаковое ограничение на разных стадиях производства не создаёт одинаковых стимулов.</w:t>
       </w:r>
       <w:r>
         <w:rPr>
@@ -281,12 +291,36 @@
     </w:p>
     <w:p>
       <w:r>
-        <w:t>Из этого следует необходимость отделять наблюдаемое изменение торговли от нормативной оценки политики. Сокращение импорта защищаемого товара не устанавливает величину выигрыша местных производителей, а рост их продаж сам по себе не определяет изменение благосостояния потребителей. Аналогично увеличение поставок гибридов ещё не показывает, какое количество электрического пробега было замещено использованием топлива. Для каждого из этих выводов нужна отдельная система показателей. Таможенные данные позволяют начать с более узкого вопроса: как меняются масштаб, состав и география ввоза в условиях изменения торговых барьеров.</w:t>
+        <w:t>Работа Ф. Вингендера с соавторами для МВФ добавляет к этому различия национальной специализации и приспособление капитала. Страна, в которой автомобильный сектор занимает большое место в производстве и экспорте, иначе реагирует на изменение конкуренции, чем экономика с иной отраслевой структурой. Различие сохраняется и внутри ЕС. Поэтому география оформления импортных автомобилей и география производственных последствий могут расходиться: через трансграничные цепочки изменение спроса передаётся предприятиям нескольких стран.</w:t>
+      </w:r>
+      <w:r>
+        <w:rPr>
+          <w:rStyle w:val="FootnoteReference"/>
+        </w:rPr>
+        <w:footnoteReference w:id="17"/>
+      </w:r>
+      <w:r/>
+    </w:p>
+    <w:p>
+      <w:r>
+        <w:t>Оценка благосостояния требует учитывать не только защищённый выпуск. В постановке Барвик с соавторами сравниваются интересы потребителей и производителей, бюджет и внешние эффекты; тариф рассматривается совместно с субсидиями, финансируемыми его доходами. Это меняет сам предмет сравнения: результат отдельной пошлины и результат пакета мер различаются. Получаемое оптимальное сочетание зависит от спроса, конкуренции и бюджетных условий модели.</w:t>
+      </w:r>
+      <w:r>
+        <w:rPr>
+          <w:rStyle w:val="FootnoteReference"/>
+        </w:rPr>
+        <w:footnoteReference w:id="18"/>
+      </w:r>
+      <w:r/>
+    </w:p>
+    <w:p>
+      <w:r>
+        <w:t>Временной горизонт также влияет на ожидаемый ответ. Цены, запасы и состав отгрузок могут изменяться при действующих мощностях. Перестройка производственной сети требует более длительных решений, а результаты поддержки исследований проявляются ещё иначе. Поэтому анализ периода непосредственно после введения меры прежде всего характеризует раннюю адаптацию. При его интерпретации необходимо учитывать, мог ли наблюдаемый процесс реализоваться в рассматриваемые сроки.</w:t>
       </w:r>
     </w:p>
     <w:p>
       <w:r>
-        <w:t>Таким образом, торговая и промышленная политика действует через несколько связанных каналов. Меняются издержки доступа на рынок, относительные условия конкуренции, стимулы покупателей и решения о размещении производства. В автомобильной отрасли эти изменения дополняются различиями силовых установок и производственных связей. Поэтому ожидаемая адаптация должна рассматриваться как совокупность возможных решений, а не как заранее заданное сокращение одного импортного потока. Разграничение этих решений позволяет перейти к анализу товарного переключения, изменения стоимости и перераспределения поставок между направлениями.</w:t>
+        <w:t>Таким образом, теория не задаёт единственного направления изменения всей автомобильной торговли после повышения барьера. Прямое удорожание затронутого товара сочетается с ценовыми решениями фирм, замещением между моделями, изменением происхождения и ассортиментной перестройкой. Для последующего анализа важно установить, какие из этих процессов совместимы с наблюдаемой динамикой и какие показатели позволяют их различать. Именно это связывает рассмотрение торговой политики с исследованием адаптации поставок.</w:t>
       </w:r>
     </w:p>
     <w:p>
@@ -299,61 +333,17 @@
     </w:p>
     <w:p>
       <w:r>
-        <w:t>Под адаптацией экспортных поставок в настоящей работе понимается изменение их масштаба, состава и распределения по направлениям при изменении условий международной торговли. Такое определение охватывает несколько решений, которые могут приниматься одновременно. Производитель выбирает набор предлагаемых моделей, экспортёр и импортёр согласуют условия поставки, посредники управляют запасами и распределением товара, а покупатели изменяют спрос. Наблюдаемая структура ввоза складывается из результатов этих решений. Поэтому один агрегированный показатель может скрывать разные экономические процессы.</w:t>
+        <w:t>Под адаптацией поставок в настоящей работе понимается изменение их объёма, товарного состава и распределения по направлениям при изменении условий торговли. Эти измерения связаны с решениями разных участников: производитель определяет ассортимент и место выпуска, импортёр — закупки, посредники — запасы и распределение. Поэтому сохранение общего потока может сопровождаться существенной перестройкой его структуры, а рост отдельной категории — сочетаться со снижением другой.</w:t>
       </w:r>
     </w:p>
     <w:p>
       <w:r>
-        <w:t>Первый механизм связан с изменением товарного предложения. Если барьер затрагивает определённую группу машин, относительные условия доступа соседних категорий на рынок могут измениться. Производитель способен увеличить предложение моделей, для которых дополнительная нагрузка ниже, либо перераспределить поставки между технологиями. Однако наличие такой возможности ещё не означает её немедленной реализации: необходимы соответствующий модельный ряд, возможность поставки и спрос. Кроме того, увеличение доли гибридов может происходить за счёт их роста, сокращения BEV или сочетания обоих изменений. Поэтому товарное переключение следует исследовать одновременно через доли и абсолютные количества.</w:t>
+        <w:t>Товарное переключение становится возможным, когда близкие по назначению продукты сталкиваются с разными условиями доступа на рынок. Если дополнительные издержки затрагивают BEV, относительное положение других технологий может улучшиться. Но возможность расширить предложение PHEV или HEV зависит от наличия моделей, производственных мощностей и спроса. Поставщик, уже выпускающий несколько типов автомобилей, и производитель, специализирующийся на одной технологии, имеют неодинаковый набор доступных решений.</w:t>
       </w:r>
     </w:p>
     <w:p>
       <w:r>
-        <w:t>Эмпирический пример приспособления ассортимента представлен в работе А. Минондо о реакции испанских экспортёров на американские тарифы, связанные со спором Airbus–Boeing. Автор показывает, что фирмы могли сохранять экспортную выручку, заменяя продукцию товарами иного происхождения и переключаясь на разновидности, не затронутые мерами. Значение этого результата состоит в расширении набора возможных ответов на тариф: сохранение суммарного экспорта не обязательно означает отсутствие воздействия на его внутреннюю структуру. Вместе с тем механизм установлен для конкретных фирм и товаров, поэтому его наличие в автомобильной торговле необходимо проверять отдельно.</w:t>
-      </w:r>
-      <w:r>
-        <w:rPr>
-          <w:rStyle w:val="FootnoteReference"/>
-        </w:rPr>
-        <w:footnoteReference w:id="17"/>
-      </w:r>
-      <w:r/>
-    </w:p>
-    <w:p>
-      <w:r>
-        <w:t>В этой связи важно различать изменение товарного состава и установление мотивов поведения. Если после введения меры увеличивается ввоз категории, не входящей в её охват, последовательность событий согласуется с гипотезой переключения. Но она может также отражать ранее начатый выпуск новых моделей, изменение предпочтений покупателей или условия конкуренции с другими производителями. Для вывода о намеренном приспособлении конкретной фирмы нужны сведения о её решениях и ассортименте. Тем более изменение таможенной структуры само по себе не устанавливает незаконного обхода мер. В эмпирическом исследовании корректнее сначала описать наблюдаемую перестройку, затем оценить допустимые объяснения.</w:t>
-      </w:r>
-    </w:p>
-    <w:p>
-      <w:r>
-        <w:t>Второй механизм проявляется в стоимости поставок. Производитель может менять цену, комплектацию и набор отгружаемых моделей, а импортёр — соотношение закупаемых автомобилей. Эти решения способны привести к различной динамике количества и стоимости. Например, увеличение числа сравнительно недорогих машин может сопровождаться небольшим ростом общей стоимости, даже если цена каждой отдельной модели остаётся неизменной. Следовательно, физическое расширение присутствия и увеличение стоимостного потока характеризуют разные стороны адаптации. Одновременное наблюдение двух показателей необходимо для разграничения масштаба ввоза и его состава.</w:t>
-      </w:r>
-    </w:p>
-    <w:p>
-      <w:r>
-        <w:t>Р. Фенстра и Дж. Ромалис показывают, что средняя стоимость единицы международно торгуемого товара связана с его качеством, а отделение качества от цены требует специальной модели и дополнительных предпосылок. Для автомобильной статистики эта проблема особенно существенна из-за разнообразия моделей внутри технологической группы. Отношение стоимости к числу ввезённых машин представляет среднюю таможенную стоимость автомобиля в рассматриваемом потоке. Изменение данного отношения нельзя автоматически интерпретировать как изменение цены одной и той же машины: могли измениться размер, комплектация или соотношение моделей.</w:t>
-      </w:r>
-      <w:r>
-        <w:rPr>
-          <w:rStyle w:val="FootnoteReference"/>
-        </w:rPr>
-        <w:footnoteReference w:id="18"/>
-      </w:r>
-      <w:r/>
-    </w:p>
-    <w:p>
-      <w:r>
-        <w:t>Поэтому в дальнейшем анализе требуется разделять арифметическое и поведенческое объяснение изменения стоимости. На уровне учёта стоимость потока определяется количеством машин и средней стоимостью единицы. Это позволяет построить точное разложение наблюдаемого изменения. Но такой расчёт сам по себе не показывает, какие фирмы снизили маржу и какие покупатели выбрали другую модель. Его результат отвечает на вопрос о компонентах статистического изменения, а для установления конкретного ценового механизма нужны цены и характеристики сопоставимых автомобилей.</w:t>
-      </w:r>
-    </w:p>
-    <w:p>
-      <w:r>
-        <w:t>Третий механизм связан с перераспределением направлений поставок. При ухудшении условий доступа на один рынок часть производителей может расширить предложение на других рынках. Такой процесс зависит от возможности найти покупателей, организовать продажи и обеспечить обслуживание. Он может сопровождаться увеличением совокупного экспорта или только изменением его распределения. Поэтому географическая адаптация не предполагает, что сокращение поставок в одну страну обязательно компенсируется равным приростом в другой. Ограничения спроса и предложения делают масштаб перенаправления отдельным предметом исследования.</w:t>
-      </w:r>
-    </w:p>
-    <w:p>
-      <w:r>
-        <w:t>П. Файгельбаум с соавторами исследуют глобальное перераспределение торговли в условиях конфликта США и Китая. Их результаты показывают, что третьи страны могут изменять экспорт не только в непосредственно затронутые экономики, но и на остальные рынки. Это важно для выбора сравнительных групп: поставщик, против которого не вводится рассматриваемая мера, также может реагировать на изменение конкуренции. В исследовании автомобильного ввоза остальные внешние поставщики ЕС поэтому служат ориентиром сравнения, но их динамика не принимается за поведение участников, гарантированно изолированных от торговой политики.</w:t>
+        <w:t>Работа А. Минондо показывает, почему реакцию экспортёров нельзя оценивать только по непосредственно затронутому товару. В эпизоде американских тарифов на испанскую продукцию автор обнаруживает сохранение выручки экспортёров при изменении происхождения части товаров и переходе к незатронутым разновидностям. Для проверки используются фирменные и товарные данные, причём возможность проследить переключение на уровне фирмы различается между продуктами. Автор отдельно указывает, что несовпадение классификаций ограничивает такую проверку для вина и сыра.</w:t>
       </w:r>
       <w:r>
         <w:rPr>
@@ -365,7 +355,22 @@
     </w:p>
     <w:p>
       <w:r>
-        <w:t>Неоднородность направлений рассматривается и в работе И. Балтеану, М. Морено и Ф. Виани о перенаправлении китайского экспорта в ЕС в результате американских тарифов. Авторы связывают различия результатов с характеристиками товаров и рынков назначения. Эта работа относится к другому торговому эпизоду, однако показывает, почему агрегированный вывод о перенаправлении требует проверки на более детальном уровне. Для автомобильной темы аналогичный принцип означает необходимость сравнивать технологии и страны, а не предполагать одинаковую реакцию всех товарно-географических потоков.</w:t>
+        <w:t>Экономический механизм этого приспособления состоит в сохранении доступа к покупателю за счёт изменения характеристик поставляемого продукта. Однако его осуществимость зависит от технологии производства. Перераспределить отгрузки между уже выпускаемыми моделями автомобиля и освоить новую силовую установку — разные решения по затратам и срокам. Поэтому для автомобильной отрасли важны исходный ассортимент и наличие готовых альтернатив. Из исследования Минондо следует возможность структурной адаптации, но не одинаковая скорость её реализации во всех отраслях.</w:t>
+      </w:r>
+    </w:p>
+    <w:p>
+      <w:r>
+        <w:t>Наблюдаемым признаком товарной перестройки служит сочетание абсолютного объёма и доли категории. Доля гибридов способна увеличиться при их росте, сокращении BEV либо одновременном движении обоих потоков. В последнем случае вклад каждой стороны зависит от масштаба изменения. Поэтому вывод о переключении требует сначала установить, что произошло с отдельными категориями и с общей корзиной. Мотивы конкретного производителя проверяются уже на другом уровне данных.</w:t>
+      </w:r>
+    </w:p>
+    <w:p>
+      <w:r>
+        <w:t>Второе измерение адаптации связано со стоимостью. Стоимость потока определяется количеством автомобилей и средней стоимостью единицы; каждый из этих компонентов может меняться. Расширение поставок сравнительно недорогих моделей, например, увеличивает физический объём быстрее общей стоимости. Напротив, переход к более дорогому модельному составу способен поддерживать стоимостный поток при сокращении числа машин. Эти варианты имеют разный экономический смысл, хотя в общей выручке различие может быть неочевидно.</w:t>
+      </w:r>
+    </w:p>
+    <w:p>
+      <w:r>
+        <w:t>Р. Фенстра и Дж. Ромалис рассматривают связь международных цен с качеством и объясняют необходимость отделять наблюдаемую стоимость единицы от цены сопоставимого качества. Для автомобильных данных это означает, что отношение таможенной стоимости к количеству машин отражает также состав моделей. Его снижение может быть связано с ценой, качественными характеристиками или изменением весов различных автомобилей. Поэтому в дальнейшем используется термин «средняя таможенная стоимость», а выделяемый стоимостный компонент трактуется с учётом состава потока.</w:t>
       </w:r>
       <w:r>
         <w:rPr>
@@ -377,22 +382,17 @@
     </w:p>
     <w:p>
       <w:r>
-        <w:t>Внутри географического изменения следует различать продолжающие и новые направления. Интенсивный компонент отражает изменение количества или стоимости в тех направлениях, где поставки уже существовали. Компонент появления направлений отражает положительный поток там, где в исходном периоде его не было. Возможен и выход — прекращение ранее наблюдавшихся поставок. Однако содержание этих понятий определяется уровнем данных. Ненулевой поток по стране не означает появления новой фирмы или новой модели: для такого вывода потребовалась бы соответствующая детализация.</w:t>
+        <w:t>Количество и стоимость характеризуют также разные стороны позиции Китая в европейском ввозе. Его доля в машинах зависит от физического объёма относительно других внешних поставщиков; доля в евро — дополнительно от средней стоимости сравниваемых потоков. Эти доли могут двигаться по-разному даже при одинаковых границах товарной корзины. Для анализа конкурентного присутствия такое расхождение содержательно: расширение числа поставленных машин и увеличение их веса в расходах импортёров не совпадают по определению.</w:t>
       </w:r>
     </w:p>
     <w:p>
       <w:r>
-        <w:t>Это различие важно для оценки распространения поставок. Увеличение числа стран с положительным ввозом показывает расширение наблюдаемой географии, но не определяет вклад новых стран в общий прирост. Несколько новых направлений с небольшими потоками могут сочетаться с основным увеличением поставок в уже существовавшие страны. Обратная ситуация также возможна. Поэтому число активных направлений и величину прироста нужно рассматривать совместно. Классификация входа и выхода при этом предполагает, что отсутствие потока установлено по данным, а не приравнено к отсутствию записи без проверки.</w:t>
+        <w:t>Географическая адаптация требует разделять два уровня. Первый — перенаправление экспорта между ЕС и другими мировыми рынками. Второй — перераспределение ввоза между государствами внутри ЕС. В первом случае изменяются внешние направления сбыта; во втором наблюдается география оформления в пределах общего объединения. Переход от одной страны ЕС к другой сам по себе не означает ухода от общеевропейской торговой меры. Для настоящей работы основным является именно второе измерение, доступное по сопоставимым таможенным записям.</w:t>
       </w:r>
     </w:p>
     <w:p>
       <w:r>
-        <w:t>Распределение объёмов по странам дополняется измерением концентрации. Индекс Херфиндаля–Хиршмана представляет сумму квадратов долей рассматриваемых направлений: большой вес крупнейших стран повышает значение показателя. При одинаковом распределении между всеми активными направлениями индекс тем меньше, чем больше их число. Обратная величина индекса может использоваться как эффективное число равновесных направлений. В отличие от простого подсчёта стран этот показатель учитывает неравномерность распределения. Для содержательного сравнения необходимо сохранять одинаковые границы товара, территории и единицы измерения.</w:t>
-      </w:r>
-    </w:p>
-    <w:p>
-      <w:r>
-        <w:t>В автомобильной торговле общий индекс концентрации зависит также от товарного состава. Если технологии изначально распределены между странами по-разному, изменение их весов меняет общую географическую картину даже при неизменной географии каждой технологии. Поэтому снижение концентрации всей корзины не обязательно означает, что каждый её компонент стал распределён равномернее. Разделение изменений групповых уровней и структуры имеет давнюю методическую основу, представленную, в частности, в работе Э. Китагавы. При нескольких взаимосвязанных факторах усреднение порядков их замены позволяет симметрично распределить вклад взаимодействия; общий подход к таким разложениям рассматривает Э. Шоррокс.</w:t>
+        <w:t>На мировом уровне ответ третьих стран может выходить за рамки простой замены одного поставщика другим. П. Файгельбаум с соавторами исследуют глобальное перераспределение торговли после конфликта США и Китая и показывают изменение экспорта стран, непосредственно не участвовавших в повышении взаимных тарифов. Для нашего исследования это означает, что остальные внешние поставщики ЕС также могут приспосабливаться к новой конкуренции. Их совокупность служит сравнительным ориентиром, динамика которого является частью общего торгового изменения.</w:t>
       </w:r>
       <w:r>
         <w:rPr>
@@ -404,17 +404,7 @@
     </w:p>
     <w:p>
       <w:r>
-        <w:t>Экономический смысл полученных компонентов определяется выбранным сравнением. Замена товарных весов при прежней географии и замена тех же весов при новой географии могут давать разные результаты. Поэтому компонент разложения представляет способ распределения наблюдаемого изменения между факторами при явно заданном правиле расчёта. Он не является самостоятельной оценкой того, что произошло бы при отсутствии торговой меры. В дальнейшем это различие позволяет использовать разложения для анализа состава потока, сохраняя отдельный вопрос о причинах его перестройки.</w:t>
-      </w:r>
-    </w:p>
-    <w:p>
-      <w:r>
-        <w:t>Для стран ЕС интерпретация географической концентрации дополнительно ограничена характером статистики. Снижение зависимости ввоза от одной юрисдикции оформления характеризует статистическое распределение потока. Оно не устанавливает снижение зависимости от определённого морского маршрута, терминала или поставщика. Одни и те же страны могут использовать общую транспортную инфраструктуру, а сведения об оформлении не содержат полной информации о последующем распределении автомобилей. Поэтому вывод о большей операционной устойчивости потребовал бы данных о реальной логистике, сроках и возможности перенаправления поставок.</w:t>
-      </w:r>
-    </w:p>
-    <w:p>
-      <w:r>
-        <w:t>Наконец, адаптация имеет временное измерение. Ожидание повышения барьера может создавать стимул ускорить отгрузки и накопить запасы, а после вступления меры в силу ввоз может замедлиться, пока эти запасы реализуются. Кавалло с соавторами обсуждают изменение закупок и запасов в связи с объявлением тарифов в исследуемом ими американском эпизоде. Для автомобильной темы такой механизм является одной из возможных причин расхождения между датами поставки и продаж. Следовательно, сравнение отдельных месяцев требует учёта последовательности сигналов и мер, сезонности и предшествующей динамики.</w:t>
+        <w:t>И. Балтеану, М. Морено и Ф. Виани рассматривают перенаправление китайского экспорта в ЕС после американских тарифов. Эта работа дополняет глобальный подход анализом неоднородности по товарам и рынкам назначения. Совместное чтение этих исследований даёт основание ожидать различий между направлениями, но не предполагает равной компенсации каждого сокращённого потока увеличением другого. Возможность перенаправления зависит от характеристик предложения и от условий спроса на принимающем рынке.</w:t>
       </w:r>
       <w:r>
         <w:rPr>
@@ -426,7 +416,61 @@
     </w:p>
     <w:p>
       <w:r>
-        <w:t>Таким образом, товарная, стоимостная и географическая адаптация образуют взаимосвязанную систему. Изменение состава технологий влияет на агрегированную стоимость и концентрацию, а географическое расширение может происходить преимущественно за счёт существовавших направлений. Из этого следует необходимость совместного анализа уровней, долей и структурных компонентов. Данный подход позволяет определить, какие изменения подтверждаются непосредственно наблюдаемыми потоками, и сформулировать отдельные вопросы для эконометрического анализа. При этом установленное статистическое изменение сохраняет самостоятельное значение, даже если его нельзя полностью связать с одним событием торговой политики.</w:t>
+        <w:t>Внутри ЕС распределение ввоза может отражать организацию обслуживания рынка, роль действующих сетей и порядок оформления. Затраты освоения новых направлений делают экономически правдоподобным расширение уже сложившихся связей, рассмотренное в параграфе 1.1. Однако страна оформления не тождественна конечному рынку сбыта. Поэтому выделение продолжающих и новых направлений является характеристикой наблюдаемой торговли, а не прямой проверкой фирменной модели выхода на рынок.</w:t>
+      </w:r>
+    </w:p>
+    <w:p>
+      <w:r>
+        <w:t>Интенсивный компонент отражает изменение потока там, где он существовал в обоих сравниваемых периодах. Появление направления означает положительный поток при его подтверждённом отсутствии в исходном периоде; прекращение — обратный переход. Увеличение числа активных стран и вклад новых стран в общий прирост при этом различаются. Несколько новых направлений с небольшими объёмами могут сочетаться с основным расширением ввоза через уже действующие. Классификация требует проверять наблюдаемость: отсутствие записи в источнике не всегда означает нулевой поток.</w:t>
+      </w:r>
+    </w:p>
+    <w:p>
+      <w:r>
+        <w:t>Другую сторону географии характеризует концентрация. Индекс Херфиндаля–Хиршмана представляет сумму квадратов долей стран; он сильнее реагирует на вес крупных направлений. Если доли выражены в единицах, обратная величина индекса показывает эффективное число равновесных направлений. В отличие от простого подсчёта стран этот показатель учитывает неравномерность распределения. Его экономическая интерпретация зависит от того, построены ли доли по количеству или стоимости и для одной технологии либо всей корзины.</w:t>
+      </w:r>
+    </w:p>
+    <w:p>
+      <w:r>
+        <w:t>Совокупная концентрация зависит не только от географии каждой технологии, но и от их весов и совпадения крупнейших направлений. Это можно показать на условном примере. Пусть каждая из двух технологий поступает исключительно через одну страну, причём страны различаются. При весах технологий 80 и 20 процентов общий индекс равен 0,68, а при равных весах — 0,50. География внутри технологий не изменилась, обе остались полностью сконцентрированными. Общий показатель снизился из-за состава корзины. Если бы обе технологии поступали через одну и ту же страну, изменение их весов не дало бы такого результата.</w:t>
+      </w:r>
+    </w:p>
+    <w:p>
+      <w:r>
+        <w:t>Следовательно, общий индекс нельзя интерпретировать как простое среднее отдельных технологических индексов. Необходимо учитывать распределение каждой технологии по странам и их сочетание в общей корзине. Содержательный вопрос состоит в том, какая часть наблюдаемого изменения связана с товарными весами, а какая — с географией внутри категорий. Поскольку эти элементы меняются совместно, вклад замены весов зависит от того, при какой географии она выполняется.</w:t>
+      </w:r>
+    </w:p>
+    <w:p>
+      <w:r>
+        <w:t>Методическое решение такой зависимости рассматривается в работе Э. Шоррокса. В разложении на основе значения Шепли вклад фактора усредняется по возможным порядкам его изменения. Для двух блоков это означает равный учёт двух последовательностей: сначала меняется состав, затем география, и наоборот. Сумма вкладов воспроизводит общее изменение показателя. Симметрия правила устраняет произвольный выбор одного порядка, но сохраняет необходимость содержательно определить сами факторы и базу сравнения.</w:t>
+      </w:r>
+      <w:r>
+        <w:rPr>
+          <w:rStyle w:val="FootnoteReference"/>
+        </w:rPr>
+        <w:footnoteReference w:id="23"/>
+      </w:r>
+      <w:r/>
+    </w:p>
+    <w:p>
+      <w:r>
+        <w:t>Снижение географической концентрации свидетельствует о более равномерном статистическом распределении ввоза. Для вывода об устойчивости поставок необходимо дополнительно знать, насколько независимы используемые маршруты и инфраструктура. Несколько стран оформления способны опираться на общие порты или перевозчиков. Поэтому в настоящей работе концентрация рассматривается как характеристика структуры потока; оценка логистической надёжности не выводится из одного индекса.</w:t>
+      </w:r>
+    </w:p>
+    <w:p>
+      <w:r>
+        <w:t>Наконец, адаптация различается по времени. Ожидание изменения условий может ускорять закупки и накопление запасов, а после вступления меры в силу — временно снижать потребность в новых поставках. Кавалло с соавторами обсуждают такую реакцию в исследуемом американском эпизоде. Для автомобильной торговли это одно из объяснений расхождения дат ввоза и продаж. Поэтому последующий анализ учитывает последовательность торговых фаз, сезонность и предшествующую траекторию, а не ограничивается сравнением двух соседних месяцев.</w:t>
+      </w:r>
+      <w:r>
+        <w:rPr>
+          <w:rStyle w:val="FootnoteReference"/>
+        </w:rPr>
+        <w:footnoteReference w:id="24"/>
+      </w:r>
+      <w:r/>
+    </w:p>
+    <w:p>
+      <w:r>
+        <w:t>Таким образом, адаптация представляет систему связанных изменений. Масштаб определяет объём торговли, состав — распределение между технологиями и моделями, география — распределение наблюдаемых потоков по странам. Различение этих элементов позволяет объяснить, почему рост гибридов, снижение общей концентрации и сохранение поставок через прежние направления могут происходить одновременно. Для их анализа далее используются сопоставимые доли, уровни и разложения, а связь с торговыми мерами проверяется отдельно.</w:t>
       </w:r>
     </w:p>
     <w:p>
@@ -439,36 +483,12 @@
     </w:p>
     <w:p>
       <w:r>
-        <w:t>Исследования автомобильной торговли и электрификации различаются не только набором стран и периодом наблюдения, но и тем, какой экономический результат они стремятся объяснить. В одних работах рассматриваются торговые потоки, в других — продажи отдельных моделей и выбор покупателей, в третьих — изменение производства, благосостояния или выбросов при заданных сценариях политики. Поэтому сопоставление литературы должно учитывать единицу анализа, способ установления связи между переменными и границы вывода. Совпадение темы пошлин на китайские автомобили ещё не означает совпадения измеряемого объекта, но и изменение объекта само по себе не освобождает от сравнения с ближайшими исследованиями.</w:t>
+        <w:t>Рассмотренные подходы по-разному объясняют изменение автомобильной торговли. Фирменные модели раскрывают выбор производителей, модели спроса — перераспределение покупок между автомобилями, модели общего равновесия — передачу изменений между секторами и странами. Эмпирические исследования торговых эпизодов устанавливают наблюдаемые реакции на конкретные ограничения. Для постановки собственного вопроса важно сопоставить не только их результаты, но и предпосылки, определяющие экономический смысл этих результатов.</w:t>
       </w:r>
     </w:p>
     <w:p>
       <w:r>
-        <w:t>Первое направление образуют модели международного производства и размещения продаж. Работа Хэда и Майера позволяет рассматривать торговый поток как результат взаимосвязанных решений фирмы о модельном ряде и источнике поставки. Для анализа китайского происхождения это задаёт важную теоретическую основу: происхождение товара является только одним измерением международной деятельности производителя. Однако на агрегированном уровне нельзя воспроизвести все фирменные решения такой модели. Следовательно, использование её логики означает прежде всего корректное определение наблюдаемого объекта и возможных каналов перестройки, а не перенесение структурных параметров из одного исследования в другое.</w:t>
-      </w:r>
-      <w:r>
-        <w:rPr>
-          <w:rStyle w:val="FootnoteReference"/>
-        </w:rPr>
-        <w:footnoteReference w:id="23"/>
-      </w:r>
-      <w:r/>
-    </w:p>
-    <w:p>
-      <w:r>
-        <w:t>Второе направление связано с воздействием торговой политики на распределение производства и макроэкономические показатели. Исследование Вингендера с соавторами для МВФ рассматривает переход Европы к электромобилям через конкуренцию, межотраслевые связи и производственную специализацию. Работа Коффина с соавторами для USITC выделяет различия между ограничениями на готовые машины и на комплектующие. Вместе эти подходы показывают, почему оценка торговой меры зависит от её места в производственной цепочке и от связи отрасли с остальной экономикой. Их результаты получены из сценарных моделей, поэтому они не подменяют анализ фактически наблюдаемого распределения ввоза между странами ЕС.</w:t>
-      </w:r>
-      <w:r>
-        <w:rPr>
-          <w:rStyle w:val="FootnoteReference"/>
-        </w:rPr>
-        <w:footnoteReference w:id="24"/>
-      </w:r>
-      <w:r/>
-    </w:p>
-    <w:p>
-      <w:r>
-        <w:t>Отдельную группу составляют исследования спроса на электромобили и общественных последствий политики. В работе Доу с соавторами, опубликованной в Nature Energy, моделируются изменения совокупной стоимости владения и принятия технологии по странам и классам автомобилей при разных ответах производителей. В статье Л. Чжан с соавторами в Resources, Conservation and Recycling рассматриваются связи торговых ограничений с выбросами и благосостоянием в сценарной модели. Такие постановки позволяют обсуждать последствия, выходящие за пределы таможенной статистики. Но переход к этим последствиям обеспечивается дополнительными данными и предпосылками; он не следует непосредственно из изменения количества ввезённых машин.</w:t>
+        <w:t>Модель Мелица объясняет отбор производителей через различия производительности и затраты участия в экспорте. Автомобильная модель Хэда и Майера добавляет выбор модели для рынка и сборочной площадки для поставки. Эти подходы дополняют друг друга: первый объясняет, почему фирмы неодинаково участвуют в торговле, второй — почему продажи бренда могут сохраняться при изменении производственного происхождения. В обеих постановках существенны решения, которые агрегированный поток объединяет в одну величину.</w:t>
       </w:r>
       <w:r>
         <w:rPr>
@@ -480,7 +500,7 @@
     </w:p>
     <w:p>
       <w:r>
-        <w:t>Более широкий нормативный вопрос ставят Барвик с соавторами в работе NBER о сочетании тарифов и субсидий при переходе к электрическому транспорту. Помимо структурной модели спроса, авторы используют европейские данные регистраций и синтетический контроль для сопоставления динамики продаж существовавших моделей китайских марок с альтернативной траекторией. В анализ включаются BEV и PHEV. Поэтому расширение исследования от одного BEV к подключаемым гибридам уже нельзя считать самостоятельным признаком новизны. Для сопоставления с нашей работой существеннее различие между регистрациями фиксированного набора моделей и таможенным потоком товаров китайского происхождения, который может включать другие марки и изменение модельного состава.</w:t>
+        <w:t>При этом представление о конкуренции в данных моделях отличается от подхода Барвик с соавторами. У Хэда и Майера используется постоянная эластичность замещения и постоянная наценка, тогда как у Барвик ценовые решения многопродуктовых фирм зависят от оцениваемого замещения между моделями. Это различие объясняет, почему одинаковое изменение издержек нельзя переводить в готовый параметр ценового переноса без выбора модели спроса. Для нашего исследования оно обосновывает совместное рассмотрение количества и стоимости; сами параметры автомобильного спроса по таможенной панели не оцениваются.</w:t>
       </w:r>
       <w:r>
         <w:rPr>
@@ -492,7 +512,7 @@
     </w:p>
     <w:p>
       <w:r>
-        <w:t>Третье направление литературы исследует наблюдаемые ответы экспортёров и перераспределение торговли. Работы Минондо и Файгельбаума с соавторами показывают, что оценка реакции не может ограничиваться одной непосредственно затронутой товарно-страновой парой. Возможно изменение разновидностей товара, происхождения и положения третьих стран. В этой группе исследований для настоящей работы важен подход к интерпретации сохранения либо роста суммарного потока: его внутренняя структура может существенно измениться. Однако установленные на фирменных данных механизмы нельзя восстановить из национальных агрегатов без дополнительной детализации.</w:t>
+        <w:t>Сопоставление работы Доу с соавторами и исследования Барвик раскрывает различие между сценарным и поведенческим способом анализа. Доу задаёт альтернативные ответы производителей и рассчитывает, как они меняют стоимость владения и электрификацию по странам и классам. Барвик использует модель потребительского выбора и ценовой конкуренции для оценки пакетов торговой и промышленной политики. В первом случае диапазон результатов связан с принятым сценарием реакции, во втором — с оценёнными зависимостями спроса и принятым механизмом конкуренции. Эти результаты отвечают на разные вопросы и не образуют единой оценки фактического тарифного эффекта.</w:t>
       </w:r>
       <w:r>
         <w:rPr>
@@ -504,7 +524,12 @@
     </w:p>
     <w:p>
       <w:r>
-        <w:t>С указанным направлением связана и проблема средней стоимости. Фенстра и Ромалис обосновывают необходимость разграничивать качество и очищенную цену международно торгуемого товара. Исследования пограничных и розничных цен, в свою очередь, показывают, что разные звенья цепочки могут реагировать неодинаково. Поэтому количество, общая стоимость и средняя стоимость единицы должны рассматриваться как взаимодополняющие показатели. В данной работе их совместное использование позволяет точнее описать структуру потока, но не заменяет модель спроса на отдельные автомобили и не даёт самостоятельной оценки изменения качества.</w:t>
+        <w:t>Особенно существенна связь сценария с исходными данными. В работе Доу база рынка относится к первой половине 2024 года, а стоимость локализации приближается через сопоставление цен моделей, выпускаемых в Китае и ЕС. С методической точки зрения такое приближение требует осторожности: межрыночная цена может отражать не только производственные затраты, но и позиционирование, налоги и различия конкуренции. Это ограничение не отменяет ценности сценария; оно показывает, какая часть ответа зависит от способа задать условия локализации. При анализе наших данных, напротив, фиксируются реализованные потоки за выбранный период, а не рассчитывается траектория принятия технологии до 2035 года.</w:t>
+      </w:r>
+    </w:p>
+    <w:p>
+      <w:r>
+        <w:t>Межотраслевые модели меняют масштаб вопроса. Коффин с соавторами отделяют готовые транспортные средства от компонентов, но объединяют электромобили и гибриды в один сектор, причём рассматривают не только легковые машины. В работе Вингендера с соавторами модели МВФ используют общий автомобильный сектор без отдельного производственного сектора EV; воздействие электрификации передаётся через заданные изменения производительности и спроса. Такая агрегация позволяет исследовать межотраслевые и макроэкономические последствия, но не предназначена для измерения перестройки между новыми BEV, бензиновыми PHEV и HEV.</w:t>
       </w:r>
       <w:r>
         <w:rPr>
@@ -516,7 +541,12 @@
     </w:p>
     <w:p>
       <w:r>
-        <w:t>Ближайший по исходной эмпирической постановке материал — бакалаврское исследование Ю. Кэ об импорте китайских BEV в ЕС после введения компенсационных пошлин. Автор использует месячные данные за январь 2022 — январь 2026 года, сравнивает Китай с Японией, Республикой Корея и США и применяет подход разностей разностей. Помимо количества анализируются стоимость и средняя стоимость единицы. В самой работе оговариваются неполная параллельность предшествующих трендов, небольшой набор сравнения и отсутствие учёта серийной корреляции в выводе. Поэтому данный материал важен как прямой аналог вопроса и набора потоков, но не как окончательное установление причинного эффекта. Его студенческий статус также необходимо отличать от статуса журнальной публикации.</w:t>
+        <w:t>Здесь возникает содержательное различие между широтой охвата и товарной детализацией. Секторальная модель прослеживает распространение изменения по экономике, опираясь на калиброванные производственные связи. Детальная торговая панель позволяет разделять технологии, сохраняя более узкий объект — зарегистрированный внешнеторговый поток. Для настоящей работы выбран второй масштаб. Его преимущество состоит в сопоставимости наблюдений по категориям и странам; вопросы выпуска и благосостояния рассматриваются как внешняя область применения, требующая дополнительных данных.</w:t>
+      </w:r>
+    </w:p>
+    <w:p>
+      <w:r>
+        <w:t>Эмпирическая литература показывает, почему даже корректно измеренный суммарный поток может быть недостаточным. В работе Минондо снижение импорта товара определённого происхождения сочетается с сохранением выручки экспортёров, поскольку меняется состав поставок. У Файгельбаума с соавторами изменяются позиции третьих стран в мировой торговле. Общее для этих работ состоит в том, что границы непосредственно затронутого потока уже границ хозяйственного приспособления. Различие заключается в наблюдаемом механизме: адаптация ассортимента и происхождения у экспортёров либо перераспределение между странами.</w:t>
       </w:r>
       <w:r>
         <w:rPr>
@@ -528,12 +558,12 @@
     </w:p>
     <w:p>
       <w:r>
-        <w:t>Сопоставление с исследованием Кэ задаёт два требования к дальнейшему анализу. Во-первых, переход к другим контрольным переменным или странам не должен трактоваться как достаточная новизна: требуется содержательный вопрос, для которого эти различия важны. Во-вторых, ограничения предшествующей динамики необходимо рассматривать как часть экономической интерпретации, а не только как техническую характеристику стандартных ошибок. Если технология уже развивалась иначе до рассматриваемого события, её последующий рост требует объяснения с учётом этой траектории. Наличие длинной панели само по себе не устраняет такую проблему.</w:t>
+        <w:t>Для исследования китайских автомобилей из этого следует необходимость сопоставлять отдельные технологии и общую корзину. Уменьшение BEV не описывает весь ответ, если одновременно растут другие категории; изменение корзины не описывает географию, если технологии распределены между странами по-разному. В отличие от прямого воспроизведения фирменного механизма такая постановка требует разложить наблюдаемый результат на согласованные компоненты. Она также позволяет отделить расширение продолжающих направлений от появления новых.</w:t>
       </w:r>
     </w:p>
     <w:p>
       <w:r>
-        <w:t>В тематически близкой литературе присутствуют также экспертные и институциональные обсуждения. Т. Шелдон и Р. Дуа рассматривают развитие рынка подключаемых автомобилей и стратегические ответы в условиях тарифов, а М. Лю с соавторами обсуждают дифференциацию торговых мер по автомобильным сегментам. Эти публикации полезны для систематизации механизмов и альтернатив политики. При этом экспертная перспектива и аргументация в пользу определённого инструмента не являются эквивалентом количественной проверки наблюдаемых потоков. При использовании таких работ важно указывать жанр и не приписывать им эмпирическую идентификацию, которой они не заявляют.</w:t>
+        <w:t>Ближайшим эмпирическим аналогом первоначального вопроса является бакалаврское исследование Ю. Кэ о ввозе китайских BEV в ЕС. В нём используются месячные данные за январь 2022 — январь 2026 года, а Китай сопоставляется с Японией, Республикой Корея и США методом разностей разностей. Анализируются количество, стоимость и средняя стоимость единицы. В самой работе обсуждаются неполная параллельность предшествующих трендов, ограниченность группы сравнения и отсутствие учёта серийной корреляции. Поэтому она полезна как прямой аналог данных и постановки, при сохранении её статуса бакалаврской работы.</w:t>
       </w:r>
       <w:r>
         <w:rPr>
@@ -545,7 +575,12 @@
     </w:p>
     <w:p>
       <w:r>
-        <w:t>К наиболее близким публикациям относится и комментарий Доу с соавторами в Joule о расширении предложения и доступности китайских электромобилей в условиях европейских тарифов. Наличие этой работы необходимо учитывать при формулировке вклада исследования. Однако основной полный текст комментария на момент подготовки главы не получен. Поэтому в настоящей работе используются подтверждённые библиографические сведения о публикации, а отсутствие пересечения её результатов с нашим анализом не предполагается. Данное ограничение исключает заявление мирового первенства изучаемых механизмов, но не препятствует проведению собственного воспроизводимого анализа.</w:t>
+        <w:t>Сопоставление с Кэ уточняет, что расширение набора контролей или стран само по себе не образует содержательного вклада. Важно изменить вопрос, на который отвечает расчёт. В нашем случае акцент переносится с одной категории и единого показателя последующей динамики на взаимосвязь товарных весов, географии внутри технологий и состава продолжающих направлений. Кроме того, предшествующая динамика рассматривается как часть интерпретации: рост после события может продолжать ранее сложившуюся траекторию. Учёт этой возможности влияет на смысл итогового фазового коэффициента.</w:t>
+      </w:r>
+    </w:p>
+    <w:p>
+      <w:r>
+        <w:t>Ещё один близкий ориентир — европейская проверка в приложении к работе Барвик. В ней используются регистрации BEV и PHEV существовавших моделей пяти китайских марок в шести странах ЕС и синтетическая сравнительная траектория. Следовательно, само включение PHEV уже представлено в литературе. Отличие нашей единицы анализа состоит в производственном происхождении товара, охвате всех стран ЕС и возможности изменения модельного состава внутри таможенного потока. Регистрации фиксированного набора моделей и ввоз автомобилей китайского происхождения способны расходиться без логического противоречия.</w:t>
       </w:r>
       <w:r>
         <w:rPr>
@@ -557,12 +592,7 @@
     </w:p>
     <w:p>
       <w:r>
-        <w:t>Обобщение литературы позволяет сформулировать конкретную исследовательскую задачу. Необходимо определить, как одновременно меняются товарный состав и географическая концентрация поставок новых электромобилей и бензиновых гибридов китайского происхождения в ЕС. Для ответа недостаточно установить рост одной технологии или снижение общего индекса концентрации. Требуется разграничить изменение долей технологий, перераспределение стран внутри каждой технологии и роль направлений, в которых поставки уже существовали либо появились впервые. Дополнительным измерением становится сопоставление количества и стоимости при одинаковых границах статистической корзины.</w:t>
-      </w:r>
-    </w:p>
-    <w:p>
-      <w:r>
-        <w:t>В качестве теоретической основы измерения используются известные методы структурного анализа. Разделение групповых уровней и весов позволяет исследовать, почему изменяется совокупный показатель, а симметричное распределение взаимодействий делает явным правило отнесения совместного изменения к отдельным факторам. Применение этих методов к автомобильным потокам не является новой математической конструкцией. Собственный вклад определяется выбором согласованного измерительного объекта, самостоятельным расчётом компонентов и объяснением того, какие выводы сохраняются при переходе от общей корзины к технологиям и странам оформления.</w:t>
+        <w:t>Наблюдаемая реакция европейского рынка рассматривается также в комментарии Х. Доу с соавторами в Joule, посвящённом расширению предложения и доступности китайских электромобилей. Наличие этой публикации дополнительно подтверждает, что вопрос адаптации уже входит в предмет современной дискуссии.</w:t>
       </w:r>
       <w:r>
         <w:rPr>
@@ -574,17 +604,12 @@
     </w:p>
     <w:p>
       <w:r>
-        <w:t>Для организации исследования выделяются четыре аналитических положения. Первое предполагает, что изменение общей географической концентрации может скрывать неодинаковую динамику технологий и требует отделения состава корзины от географии внутри неё. Второе связывает расширение гибридных поставок преимущественно с увеличением потоков в продолжающие страны оформления, а не только с появлением новых направлений. Третье допускает расхождение между усилением физической доли Китая и изменением его стоимостной доли. Каждое из этих положений проверяется на величинах, непосредственно определённых выбранной статистической панелью.</w:t>
+        <w:t>На этой основе центральный вопрос формулируется следующим образом: как изменение товарного состава сочетается с изменением географической концентрации поставок новых электромобилей и бензиновых гибридов китайского происхождения в ЕС? Для ответа необходимо сопоставить общую корзину с отдельными технологиями, количество со стоимостью и общий прирост с вкладом направлений, на которых поток уже существовал. Такое сопоставление позволяет определить, означает ли изменение агрегированного показателя однотипную перестройку всех составляющих.</w:t>
       </w:r>
     </w:p>
     <w:p>
       <w:r>
-        <w:t>Четвёртое положение касается дополнительного фазового сдвига: положительное изменение относительных потоков PHEV после введения окончательных мер может сохраняться при учёте предшествующей траектории и сезонности. В отличие от арифметических разложений такая проверка зависит от модели и сравнительной группы. Поэтому результатом может стать как выделение дополнительной условной ассоциации, так и отсутствие её уверенного подтверждения. Аналитические положения используются для организации исследования; предварительная регистрация гипотез не проводилась, а постановка уточнялась после первичного изучения данных.</w:t>
-      </w:r>
-    </w:p>
-    <w:p>
-      <w:r>
-        <w:t>Количественный анализ строится на разделении двух типов доказательств. Структурные тождества позволяют точно распределить наблюдаемое изменение между статистическими компонентами. Модель условных относительных потоков показывает, как выделяется связь с торговыми фазами при включённых контролях. Метод PPML, обоснованный в торговой литературе работой Ж. Сантуша Силвы и С. Тенрейро, позволяет анализировать неотрицательные потоки без предварительного логарифмирования зависимой переменной. Однако выбор оценивателя не создаёт сам по себе причинной идентификации. Содержательный вывод требует учитывать устройство сравнения и предшествующую динамику.</w:t>
+        <w:t>Собственный эмпирический вклад состоит в совместном измерении этих компонентов на согласованной месячной панели. Для структурного анализа используется известный принцип симметричного распределения вкладов, рассмотренный Шорроксом; он не заявляется новой математической конструкцией. Вклад определяется полученным разложением конкретного торгового изменения и тем, какие экономические объяснения согласуются с его составом. Подробные формулы, базы сравнения и проверки точного сложения компонентов относятся ко второй главе.</w:t>
       </w:r>
       <w:r>
         <w:rPr>
@@ -596,7 +621,29 @@
     </w:p>
     <w:p>
       <w:r>
-        <w:t>Таким образом, исследование занимает место на пересечении анализа товарной адаптации, географии торговли и измерения результатов торговой политики. Его предметом являются наблюдаемые компоненты перестройки поставок и границы их модельной интерпретации. Полученные выводы должны позволить перейти от общей констатации изменения импорта к системе показателей, различающих технологии, количество, стоимость и концентрацию. Такая постановка одновременно задаёт основу для аналитической главы и определяет пределы последующих рекомендаций: они будут опираться на измеренные торговые изменения, а вопросы оптимального тарифа, благосостояния и экологического результата останутся за пределами собственной модели.</w:t>
+        <w:t>Из теории вытекают четыре аналитических положения, организующие дальнейшую проверку. Первое связывает изменение общей концентрации с сочетанием товарных весов и географии внутри технологий: одинаковое движение отдельных категорий не предполагается. Второе допускает преобладающий вклад продолжающих направлений в расширение гибридных поставок. Его экономическая мотивация связана с использованием уже действующих связей, а проверка проводится на уровне наблюдаемых стран оформления. Третье предполагает возможность различной динамики физической и стоимостной долей Китая вследствие изменения средней стоимости и состава потоков.</w:t>
+      </w:r>
+    </w:p>
+    <w:p>
+      <w:r>
+        <w:t>Четвёртое положение касается дополнительного изменения относительных потоков PHEV после введения окончательных мер при учёте сезонности и предшествующей траектории. Это положение проверяется отдельно от структурных тождеств: его результат зависит от модели и сравнительной группы. Положения сформулированы как рабочие направления анализа; предварительная регистрация гипотез не проводилась, а постановка уточнялась после первоначального изучения данных. Они не используются как заранее доказанные объяснения наблюдаемой динамики.</w:t>
+      </w:r>
+    </w:p>
+    <w:p>
+      <w:r>
+        <w:t>В исследовании тем самым разделяются описательное разложение и проверка условной связи. Первое устанавливает, из каких наблюдаемых компонентов складывается изменение. Вторая использует PPML для неотрицательных торговых потоков и сопоставляет фазы при включённых контролях. Работа Ж. Сантуша Силвы и С. Тенрейро обосновывает применение такого оценивателя без предварительного логарифмирования зависимой переменной; выбор оценивателя при этом не заменяет обоснование сравнительной конструкции.</w:t>
+      </w:r>
+      <w:r>
+        <w:rPr>
+          <w:rStyle w:val="FootnoteReference"/>
+        </w:rPr>
+        <w:footnoteReference w:id="34"/>
+      </w:r>
+      <w:r/>
+    </w:p>
+    <w:p>
+      <w:r>
+        <w:t>Таким образом, теоретическая основа работы связывает решения производителей с измерением товарной и географической перестройки. Во второй главе эта постановка реализуется через сопоставимую панель, разложения и модельные проверки. На установленные изменения торговли будут опираться последующие рекомендации.</w:t>
       </w:r>
     </w:p>
     <w:p>
@@ -609,22 +656,22 @@
     </w:p>
     <w:p>
       <w:r>
-        <w:t>Теоретический анализ показал, что международная автомобильная торговля формируется на пересечении производственных и сбытовых решений. Происхождение товара, национальность марки, страна таможенного оформления и конечный рынок характеризуют разные стороны этого процесса. Поэтому изменение поставок автомобилей китайского происхождения нельзя непосредственно трактовать как изменение продаж китайских марок или спроса населения отдельных государств ЕС.</w:t>
+        <w:t>Теоретическая основа исследования связывает автомобильную торговлю с неоднородностью производителей, затратами участия в зарубежных рынках и организацией многонационального производства. При изменении торговых условий фирмы способны менять объём продаж, ассортимент и источник поставки. Возможность каждого решения определяется исходной производственной сетью и доступными моделями. Поэтому происхождение автомобиля, принадлежность марки и конечный рынок необходимо различать при переходе от поведения фирм к таможенным показателям.</w:t>
       </w:r>
     </w:p>
     <w:p>
       <w:r>
-        <w:t>Разделение BEV, PHEV и HEV необходимо для содержательного анализа товарной структуры. Эти технологии различаются способом получения энергии и условиями эксплуатации, вследствие чего могут по-разному реагировать на изменение относительных затрат и доступности моделей. Одновременно технические определения требуют согласования с товарной номенклатурой и юридическим охватом конкретных мер. Общая динамика выбранной корзины должна рассматриваться вместе с изменением составляющих её категорий.</w:t>
+        <w:t>Реакция на торговый барьер зависит от замещения между автомобилями и ценовых решений производителей. В условиях технологического перехода защита определённого выпуска и доступность электрического транспорта могут изменяться по-разному. Рассмотренные работы также показывают значение стадии производственной цепочки и горизонта адаптации. Сценарий локализации, модель ценовой конкуренции и наблюдаемое изменение импорта характеризуют разные стороны одного процесса и требуют соответствующих данных.</w:t>
       </w:r>
     </w:p>
     <w:p>
       <w:r>
-        <w:t>Торговые ограничения способны затронуть цены, ассортимент, направления поставок и размещение производства. При этом краткосрочная реакция потоков не определяет весь долгосрочный результат политики. Появление новых стран ввоза не устанавливает их преобладающий вклад в прирост, а снижение общей концентрации может сопровождаться её повышением по отдельной технологии. Аналогично различия количества и стоимости требуют анализа состава поставок, а не автоматического объяснения изменением очищенной цены.</w:t>
+        <w:t>В товарном анализе необходимо разделять BEV, PHEV и HEV, абсолютные количества и доли, общую стоимость и среднюю стоимость единицы. В географическом анализе следует учитывать продолжающие и новые направления, неравномерность распределения и различие между оформлением и конечным потреблением. Общая концентрация зависит от товарных весов и сочетания географии технологий. Поэтому её снижение возможно даже при неизменной концентрации каждой категории; объяснение такого результата требует отдельного разложения состава и географии.</w:t>
       </w:r>
     </w:p>
     <w:p>
       <w:r>
-        <w:t>Рассмотренная литература обосновывает совместное использование товарного, стоимостного и географического измерений, одновременно показывая различия между наблюдаемой торговлей, модельными сценариями и оценкой общественных последствий. На этой основе исследование сосредоточено на разложении наблюдаемой перестройки китайских поставок и проверке условной связи относительных потоков с фазами торговых мер. Во второй главе данная постановка реализуется через формирование сопоставимой панели, структурные расчёты и эконометрический анализ с раскрытием чувствительности результатов.</w:t>
+        <w:t>Сопоставление литературы определило задачу исследования: установить, как совместно меняются товарный состав и распределение китайских поставок новых электромобилей и бензиновых гибридов между странами ЕС. Эмпирический вклад состоит в измерении компонентов этой перестройки по количеству и стоимости. Связь с торговыми фазами проверяется дополнительно с учётом предшествующей динамики.</w:t>
       </w:r>
     </w:p>
     <w:sectPr>
@@ -687,7 +734,7 @@
         <w:footnoteRef/>
       </w:r>
       <w:r>
-        <w:t xml:space="preserve"> Head K., Mayer T. Brands in Motion: How frictions shape multinational production. Banque de France Working Paper 629. 2017. Introduction, PDF-с. 4–7.</w:t>
+        <w:t xml:space="preserve"> Melitz M. J. The Impact of Trade on Intra-Industry Reallocations and Aggregate Industry Productivity // Econometrica 71(6),1695–1725. 2003. DOI 10.1111/1468-0262.00467. С. 1695–1698.</w:t>
       </w:r>
     </w:p>
   </w:footnote>
@@ -703,7 +750,7 @@
         <w:footnoteRef/>
       </w:r>
       <w:r>
-        <w:t xml:space="preserve"> IEA. Global EV Outlook 2025. Paris, 2025. P. 31–34.</w:t>
+        <w:t xml:space="preserve"> Head K., Mayer T. Brands in Motion: How frictions shape multinational production. Banque de France Working Paper 629. 2017. Раздел 3, с. 14–19 (рабочая версия).</w:t>
       </w:r>
     </w:p>
   </w:footnote>
@@ -719,7 +766,7 @@
         <w:footnoteRef/>
       </w:r>
       <w:r>
-        <w:t xml:space="preserve"> U.S. Department of Energy. Alternative Fuels Data Center. All-Electric Vehicles. Раздел How It Works (дата обращения: 27.10.2026).</w:t>
+        <w:t xml:space="preserve"> IEA. Global EV Outlook 2025. Paris, 2025. P. 31–34.</w:t>
       </w:r>
     </w:p>
   </w:footnote>
@@ -735,7 +782,7 @@
         <w:footnoteRef/>
       </w:r>
       <w:r>
-        <w:t xml:space="preserve"> U.S. Department of Energy. Alternative Fuels Data Center. Plug-In Hybrid Electric Vehicles. Разделы How It Works, Fueling and Driving Options (дата обращения: 27.10.2026).</w:t>
+        <w:t xml:space="preserve"> U.S. Department of Energy. Alternative Fuels Data Center. All-Electric Vehicles. Раздел How It Works (дата обращения: 27.10.2026).</w:t>
       </w:r>
     </w:p>
   </w:footnote>
@@ -751,7 +798,7 @@
         <w:footnoteRef/>
       </w:r>
       <w:r>
-        <w:t xml:space="preserve"> U.S. Department of Energy. Alternative Fuels Data Center. Hybrid Electric Vehicles. Разделы Regenerative Braking, Fuel-Efficient System Design (дата обращения: 27.10.2026).</w:t>
+        <w:t xml:space="preserve"> U.S. Department of Energy. Alternative Fuels Data Center. Plug-In Hybrid Electric Vehicles. Разделы How It Works, Fueling and Driving Options (дата обращения: 27.10.2026).</w:t>
       </w:r>
     </w:p>
   </w:footnote>
@@ -767,7 +814,7 @@
         <w:footnoteRef/>
       </w:r>
       <w:r>
-        <w:t xml:space="preserve"> European Commission. EU Commission imposes countervailing duties on imports of battery electric vehicles (BEVs) from China. Access 2Markets, 12.12.2024. Описание охвата меры по Регламенту (ЕС) 2024/2754 (дата обращения: 27.10.2026).</w:t>
+        <w:t xml:space="preserve"> U.S. Department of Energy. Alternative Fuels Data Center. Hybrid Electric Vehicles. Разделы Regenerative Braking, Fuel-Efficient System Design (дата обращения: 27.10.2026).</w:t>
       </w:r>
     </w:p>
   </w:footnote>
@@ -783,7 +830,7 @@
         <w:footnoteRef/>
       </w:r>
       <w:r>
-        <w:t xml:space="preserve"> Eurostat. International trade in goods — detailed data. Reference metadata. Разделы 3.2–3.4 (дата обращения: 27.10.2026).</w:t>
+        <w:t xml:space="preserve"> European Commission. EU Commission imposes countervailing duties on imports of battery electric vehicles (BEVs) from China. Access 2Markets, 12.12.2024. Описание охвата меры по Регламенту (ЕС) 2024/2754 (дата обращения: 27.10.2026).</w:t>
       </w:r>
     </w:p>
   </w:footnote>
@@ -799,7 +846,7 @@
         <w:footnoteRef/>
       </w:r>
       <w:r>
-        <w:t xml:space="preserve"> Eurostat. Trade in goods. European statistics learning hub. Раздел What is the Rotterdam effect? (дата обращения: 27.10.2026).</w:t>
+        <w:t xml:space="preserve"> Eurostat. International trade in goods — detailed data. Reference metadata. Разделы 3.2–3.4 (дата обращения: 27.10.2026).</w:t>
       </w:r>
     </w:p>
   </w:footnote>
@@ -815,7 +862,7 @@
         <w:footnoteRef/>
       </w:r>
       <w:r>
-        <w:t xml:space="preserve"> IEA. Global EV Outlook 2025. Paris, 2025. P. 33–35, примечания к данным международной торговли.</w:t>
+        <w:t xml:space="preserve"> Eurostat. Trade in goods. European statistics learning hub. Раздел What is the Rotterdam effect? (дата обращения: 27.10.2026).</w:t>
       </w:r>
     </w:p>
   </w:footnote>
@@ -831,7 +878,7 @@
         <w:footnoteRef/>
       </w:r>
       <w:r>
-        <w:t xml:space="preserve"> Amiti M., Redding S. J., Weinstein D. E. The Impact of the 2018 Tariffs on Prices and Welfare // Journal of Economic Perspectives 33(4),187–210. 2019. DOI 10.1257/jep.33.4.187. Целевое чтение с. 187–189. Cavallo A., Gopinath G., Neiman B., Tang J. Tariff Pass-Through at the Border and at the Store: Evidence from US Trade Policy // American Economic Review: Insights 3(1),19–34. 2021. DOI 10.1257/aeri.20190536. Для второй работы использован NBER Working Paper 26396 (2019), аннотация и введение.</w:t>
+        <w:t xml:space="preserve"> IEA. Global EV Outlook 2025. Paris, 2025. P. 33–35, примечания к данным международной торговли.</w:t>
       </w:r>
     </w:p>
   </w:footnote>
@@ -847,7 +894,7 @@
         <w:footnoteRef/>
       </w:r>
       <w:r>
-        <w:t xml:space="preserve"> European Commission. Anti-subsidy measures; Anti-subsidy investigations. Trade and Economic Security. Описание инструментов и предмета расследования (дата обращения: 27.10.2026).</w:t>
+        <w:t xml:space="preserve"> Barwick P. J., Collison J., Goldberg P. K. et al. From Trade War to Green Transition: Optimal Electric Vehicle Tariffs with Revenue-Funded Subsidies // NBER Working Paper 35334, June 2026. DOI 10.3386/w35334. Разделы 4.1–4.2.</w:t>
       </w:r>
     </w:p>
   </w:footnote>
@@ -863,7 +910,7 @@
         <w:footnoteRef/>
       </w:r>
       <w:r>
-        <w:t xml:space="preserve"> Bickenbach F., Dohse D., Langhammer R. J., Liu W.-H. EU Concerns About Chinese Subsidies: What the Evidence Suggests // Intereconomics 59(4),214–221. 2024. DOI 10.2478/ie-2024-0044.</w:t>
+        <w:t xml:space="preserve"> Amiti M., Redding S. J., Weinstein D. E. The Impact of the 2018 Tariffs on Prices and Welfare // Journal of Economic Perspectives 33(4),187–210. 2019. DOI 10.1257/jep.33.4.187. С. 187–189. Cavallo A., Gopinath G., Neiman B., Tang J. Tariff Pass-Through at the Border and at the Store: Evidence from US Trade Policy. NBER Working Paper 26396. 2019. Аннотация и введение.</w:t>
       </w:r>
     </w:p>
   </w:footnote>
@@ -879,7 +926,7 @@
         <w:footnoteRef/>
       </w:r>
       <w:r>
-        <w:t xml:space="preserve"> Dou H. et al. Distributional impacts of EU tariffs on Chinese electric vehicles across European markets // Nature Energy; accepted author version. 2026. DOI 10.1038/s41560-026-02105-7. Принятая авторская версия, аннотация.</w:t>
+        <w:t xml:space="preserve"> European Commission. Anti-subsidy measures; Anti-subsidy investigations. Trade and Economic Security. Описание инструментов и предмета расследования (дата обращения: 27.10.2026).</w:t>
       </w:r>
     </w:p>
   </w:footnote>
@@ -895,7 +942,7 @@
         <w:footnoteRef/>
       </w:r>
       <w:r>
-        <w:t xml:space="preserve"> Coffin D., Crotty P., Walling J., Yuan W. J. J. The Impact of Changes in Trade Policies on the Electric Vehicle (EV) Sector – A CGE Analysis // USITC Economics Working Paper 2024–05–A. Аннотация, с. 2.</w:t>
+        <w:t xml:space="preserve"> Bickenbach F., Dohse D., Langhammer R. J., Liu W.-H. EU Concerns About Chinese Subsidies: What the Evidence Suggests // Intereconomics 59(4),214–221. 2024. DOI 10.2478/ie-2024-0044.</w:t>
       </w:r>
     </w:p>
   </w:footnote>
@@ -911,7 +958,7 @@
         <w:footnoteRef/>
       </w:r>
       <w:r>
-        <w:t xml:space="preserve"> Wingender P., Yao J., Zymek R. et al. Europe’s Shift to EVs Amid Intensifying Global Competition // IMF Working Paper 24/218. 2024. Аннотация; разделы 3–4.</w:t>
+        <w:t xml:space="preserve"> Dou H. et al. Distributional impacts of EU tariffs on Chinese electric vehicles across European markets // Nature Energy; accepted author version. 2026. DOI 10.1038/s41560-026-02105-7. Принятая авторская версия, с. 5–9, 18–19.</w:t>
       </w:r>
     </w:p>
   </w:footnote>
@@ -927,7 +974,7 @@
         <w:footnoteRef/>
       </w:r>
       <w:r>
-        <w:t xml:space="preserve"> Barwick P. J., Collison J., Goldberg P. K. et al. From Trade War to Green Transition: Optimal Electric Vehicle Tariffs with Revenue-Funded Subsidies // NBER Working Paper 35334, June 2026. DOI 10.3386/w35334. Разделы 2, 5–6.</w:t>
+        <w:t xml:space="preserve"> Coffin D., Crotty P., Walling J., Yuan W. J. J. The Impact of Changes in Trade Policies on the Electric Vehicle (EV) Sector – A CGE Analysis // USITC Economics Working Paper 2024–05–A. Раздел методологии, с. 7–9.</w:t>
       </w:r>
     </w:p>
   </w:footnote>
@@ -943,7 +990,7 @@
         <w:footnoteRef/>
       </w:r>
       <w:r>
-        <w:t xml:space="preserve"> Minondo A. How exporters neutralised an increase in tariffs // The World Economy 47(3), 1274–1296. 2024. DOI 10.1111/twec.13492. С. 1274–1275.</w:t>
+        <w:t xml:space="preserve"> Wingender P., Yao J., Zymek R. et al. Europe’s Shift to EVs Amid Intensifying Global Competition // IMF Working Paper 24/218. 2024. Разделы 3.1–3.2, с. 12–16.</w:t>
       </w:r>
     </w:p>
   </w:footnote>
@@ -959,7 +1006,7 @@
         <w:footnoteRef/>
       </w:r>
       <w:r>
-        <w:t xml:space="preserve"> Feenstra R. C., Romalis J. International Prices and Endogenous Quality // Quarterly Journal of Economics 129(2),477–527. 2014. DOI 10.1093/qje/qju 001. Использована NBER-версия 2012 года, аннотация и введение.</w:t>
+        <w:t xml:space="preserve"> Barwick P. J. et al. From Trade War to Green Transition. NBER WP 35334. 2026. Раздел 2.</w:t>
       </w:r>
     </w:p>
   </w:footnote>
@@ -975,7 +1022,7 @@
         <w:footnoteRef/>
       </w:r>
       <w:r>
-        <w:t xml:space="preserve"> Fajgelbaum P., Goldberg P., Kennedy P. et al. The US-China Trade War and Global Reallocations // American Economic Review: Insights 6(2),295–312. 2024. DOI 10.1257/aeri.20230094. Прочитана NBER-версия, пересмотренная в декабре 2023 года, аннотация и введение.</w:t>
+        <w:t xml:space="preserve"> Minondo A. How exporters neutralised an increase in tariffs // The World Economy 47(3), 1274–1296. 2024. DOI 10.1111/twec.13492. С. 1275–1277, 1292–1293.</w:t>
       </w:r>
     </w:p>
   </w:footnote>
@@ -991,7 +1038,7 @@
         <w:footnoteRef/>
       </w:r>
       <w:r>
-        <w:t xml:space="preserve"> Balteanu I., Moreno M., Viani F. Flooded by China? Trade diversion due to US tariffs during Trump’s first mandate // Banco de España Working Paper 2634, October 2026. DOI 10.53479/44545. Аннотация.</w:t>
+        <w:t xml:space="preserve"> Feenstra R. C., Romalis J. International Prices and Endogenous Quality. NBER Working Paper 18314. 2012. Аннотация и введение.</w:t>
       </w:r>
     </w:p>
   </w:footnote>
@@ -1007,7 +1054,7 @@
         <w:footnoteRef/>
       </w:r>
       <w:r>
-        <w:t xml:space="preserve"> Kitagawa E. M. Components of a Difference Between Two Rates // Journal of the American Statistical Association 50(272),1168–1194. 1955. DOI 10.1080/01621459.1955.10501299. Shorrocks A. F. Decomposition procedures for distributional analysis: a unified framework based on the Shapley value // Journal of Economic Inequality 11,99–126. 2013. DOI 10.1007/s10888-011-9214-z.</w:t>
+        <w:t xml:space="preserve"> Fajgelbaum P., Goldberg P., Kennedy P. et al. The US-China Trade War and Global Reallocations. NBER Working Paper 29562. Revised December 2023. Введение.</w:t>
       </w:r>
     </w:p>
   </w:footnote>
@@ -1023,7 +1070,7 @@
         <w:footnoteRef/>
       </w:r>
       <w:r>
-        <w:t xml:space="preserve"> Cavallo A., Gopinath G., Neiman B., Tang J. Tariff Pass-Through at the Border and at the Store: Evidence from US Trade Policy // American Economic Review: Insights 3(1),19–34. 2021. DOI 10.1257/aeri.20190536. Прочитана NBER-версия 26396 (2019), введение, с. 3–4.</w:t>
+        <w:t xml:space="preserve"> Balteanu I., Moreno M., Viani F. Flooded by China? Trade diversion due to US tariffs during Trump’s first mandate // Banco de España Working Paper 2634, October 2026. DOI 10.53479/44545. Аннотация.</w:t>
       </w:r>
     </w:p>
   </w:footnote>
@@ -1039,7 +1086,7 @@
         <w:footnoteRef/>
       </w:r>
       <w:r>
-        <w:t xml:space="preserve"> Head K., Mayer T. Brands in Motion: How frictions shape multinational production. Banque de France Working Paper 629. 2017. Introduction, PDF-с. 4–7.</w:t>
+        <w:t xml:space="preserve"> Shorrocks A. F. Decomposition Procedures for Distributional Analysis: A Unified Framework Based on the Shapley Value. First draft, June 1999. Раздел 2, с. 4–7.</w:t>
       </w:r>
     </w:p>
   </w:footnote>
@@ -1055,7 +1102,7 @@
         <w:footnoteRef/>
       </w:r>
       <w:r>
-        <w:t xml:space="preserve"> Wingender P., Yao J., Zymek R. et al. Europe’s Shift to EVs Amid Intensifying Global Competition // IMF Working Paper 24/218. 2024. Coffin D., Crotty P., Walling J., Yuan W. J. J. The Impact of Changes in Trade Policies on the Electric Vehicle (EV) Sector – A CGE Analysis // USITC Economics Working Paper 2024–05–A.</w:t>
+        <w:t xml:space="preserve"> Cavallo A. et al. Tariff Pass-Through at the Border and at the Store. NBER WP 26396. 2019. С. 3–4.</w:t>
       </w:r>
     </w:p>
   </w:footnote>
@@ -1071,7 +1118,7 @@
         <w:footnoteRef/>
       </w:r>
       <w:r>
-        <w:t xml:space="preserve"> Dou H. et al. Distributional impacts of EU tariffs on Chinese electric vehicles across European markets // Nature Energy; accepted author version. 2026. DOI 10.1038/s41560-026-02105-7. Zhang L., Wen Z., Sun X. et al. Revealing the impact of electric vehicles trade restrictions on greenhouse gas emissions and welfare // Resources, Conservation and Recycling 227,108744. 2026. DOI 10.1016/j.resconrec.2025.108744. Вторая работа используется по издательской аннотации.</w:t>
+        <w:t xml:space="preserve"> Head K., Mayer T. Brands in Motion. Banque de France WP 629. 2017. Раздел 3. Melitz M. J. The Impact of Trade on Intra-Industry Reallocations and Aggregate Industry Productivity // Econometrica 71(6),1695–1725. 2003. DOI 10.1111/1468-0262.00467. С. 1695–1698.</w:t>
       </w:r>
     </w:p>
   </w:footnote>
@@ -1087,7 +1134,7 @@
         <w:footnoteRef/>
       </w:r>
       <w:r>
-        <w:t xml:space="preserve"> Barwick P. J., Collison J., Goldberg P. K. et al. From Trade War to Green Transition: Optimal Electric Vehicle Tariffs with Revenue-Funded Subsidies // NBER Working Paper 35334, June 2026. DOI 10.3386/w35334. Раздел 6.2 и приложение D.1.</w:t>
+        <w:t xml:space="preserve"> Head K., Mayer T. Brands in Motion. Banque de France WP 629. 2017. Раздел 3. Barwick P. J. et al. From Trade War to Green Transition. NBER WP 35334. 2026. Разделы 4.1–4.2.</w:t>
       </w:r>
     </w:p>
   </w:footnote>
@@ -1103,7 +1150,7 @@
         <w:footnoteRef/>
       </w:r>
       <w:r>
-        <w:t xml:space="preserve"> Minondo A. How exporters neutralised an increase in tariffs // The World Economy 47(3), 1274–1296. 2024. DOI 10.1111/twec.13492. Fajgelbaum P., Goldberg P., Kennedy P. et al. The US-China Trade War and Global Reallocations // American Economic Review: Insights 6(2),295–312. 2024. DOI 10.1257/aeri.20230094.</w:t>
+        <w:t xml:space="preserve"> Dou H. et al. Distributional impacts of EU tariffs on Chinese electric vehicles across European markets. 2026. Принятая авторская версия, с. 5–9, 18–19. Barwick P. J. et al. From Trade War to Green Transition. NBER WP 35334. 2026. Разделы 2 и 4.</w:t>
       </w:r>
     </w:p>
   </w:footnote>
@@ -1119,7 +1166,7 @@
         <w:footnoteRef/>
       </w:r>
       <w:r>
-        <w:t xml:space="preserve"> Feenstra R. C., Romalis J. International Prices and Endogenous Quality // Quarterly Journal of Economics 129(2),477–527. 2014. DOI 10.1093/qje/qju 001. Cavallo A., Gopinath G., Neiman B., Tang J. Tariff Pass-Through at the Border and at the Store: Evidence from US Trade Policy // American Economic Review: Insights 3(1),19–34. 2021. DOI 10.1257/aeri.20190536.</w:t>
+        <w:t xml:space="preserve"> Wingender P. et al. Europe’s Shift to EVs Amid Intensifying Global Competition. IMF WP 24/218. 2024. С. 12–16. Coffin D. et al. The Impact of Changes in Trade Policies on the Electric Vehicle Sector. USITC 2024–05–A. С. 7–9.</w:t>
       </w:r>
     </w:p>
   </w:footnote>
@@ -1135,7 +1182,7 @@
         <w:footnoteRef/>
       </w:r>
       <w:r>
-        <w:t xml:space="preserve"> Ke Y. EU Countervailing Duties and Chinese BEV Trade Flows: Descriptive Evidence from a Difference-in-Differences Analysis // Bachelor thesis, Umeå University. 2026. Аннотация; обсуждение ограничений. Бакалаврская работа.</w:t>
+        <w:t xml:space="preserve"> Minondo A. How exporters neutralised an increase in tariffs. 2024. С. 1275–1277. Fajgelbaum P. et al. The US-China Trade War and Global Reallocations. NBER WP 29562. Редакция декабря 2023.</w:t>
       </w:r>
     </w:p>
   </w:footnote>
@@ -1151,7 +1198,7 @@
         <w:footnoteRef/>
       </w:r>
       <w:r>
-        <w:t xml:space="preserve"> Sheldon T. L., Dua R. A perspective on the evolving plug-in electric vehicle landscape amid trade tariffs and strategic responses // Energy Research &amp; Social Science 127,104327. 2025. DOI 10.1016/j.erss.2025.104327. Liu M., Hao H., Sun X. et al. The potential for differentiated vehicle segment tariffs // Nature Energy 10,1042–1044. 2025. DOI 10.1038/s41560-025-01798-6. По доступным аннотациям и фрагментам.</w:t>
+        <w:t xml:space="preserve"> Ke Y. EU Countervailing Duties and Chinese BEV Trade Flows: Descriptive Evidence from a Difference-in-Differences Analysis // Bachelor thesis, Umeå University. 2026. Аннотация; обсуждение ограничений. Бакалаврская работа.</w:t>
       </w:r>
     </w:p>
   </w:footnote>
@@ -1167,7 +1214,7 @@
         <w:footnoteRef/>
       </w:r>
       <w:r>
-        <w:t xml:space="preserve"> Dou H., Hao H., Mai L. et al. Observed constrained expansion and diminished affordability under the EU’s tariffs on Chinese electric vehicles // Joule 10(6),102486. 2026. DOI 10.1016/j.joule.2026.102486. Основной полный текст не получен. Проверены издательские метаданные и карточка University of Groningen (дата обращения: 27.10.2026).</w:t>
+        <w:t xml:space="preserve"> Barwick P. J. et al. From Trade War to Green Transition. NBER WP 35334. 2026. Раздел 6.2 и приложение D.1.</w:t>
       </w:r>
     </w:p>
   </w:footnote>
@@ -1183,11 +1230,27 @@
         <w:footnoteRef/>
       </w:r>
       <w:r>
-        <w:t xml:space="preserve"> Kitagawa E. M. Components of a Difference Between Two Rates // Journal of the American Statistical Association 50(272),1168–1194. 1955. DOI 10.1080/01621459.1955.10501299. Shorrocks A. F. Decomposition procedures for distributional analysis: a unified framework based on the Shapley value // Journal of Economic Inequality 11,99–126. 2013. DOI 10.1007/s10888-011-9214-z.</w:t>
+        <w:t xml:space="preserve"> Dou H., Hao H., Mai L. et al. Observed constrained expansion and diminished affordability under the EU’s tariffs on Chinese electric vehicles // Joule 10(6),102486. 2026. DOI 10.1016/j.joule.2026.102486. Основной полный текст не получен. Проверены издательские метаданные и карточка University of Groningen (дата обращения: 27.10.2026).</w:t>
       </w:r>
     </w:p>
   </w:footnote>
   <w:footnote w:id="33">
+    <w:p>
+      <w:pPr>
+        <w:pStyle w:val="FootnoteText"/>
+      </w:pPr>
+      <w:r>
+        <w:rPr>
+          <w:rStyle w:val="FootnoteReference"/>
+        </w:rPr>
+        <w:footnoteRef/>
+      </w:r>
+      <w:r>
+        <w:t xml:space="preserve"> Shorrocks A. F. Decomposition Procedures for Distributional Analysis. First draft, 1999. Раздел 2.</w:t>
+      </w:r>
+    </w:p>
+  </w:footnote>
+  <w:footnote w:id="34">
     <w:p>
       <w:pPr>
         <w:pStyle w:val="FootnoteText"/>

</xml_diff>